<commit_message>
Student handout: revise to Lesson 2 short-response format (3-col vocab w/ line refs in cell, defs header row, bare stems + underscore lines, type-tag heading)
</commit_message>
<xml_diff>
--- a/F6_SP_Lesson_4_2013_Part_A_Open-Ended_Student_Version.docx
+++ b/F6_SP_Lesson_4_2013_Part_A_Open-Ended_Student_Version.docx
@@ -4,6 +4,7 @@
   <w:body>
     <w:p>
       <w:pPr>
+        <w:pStyle w:val="Title"/>
         <w:spacing w:after="160"/>
       </w:pPr>
       <w:r>
@@ -17,6 +18,7 @@
     </w:p>
     <w:p>
       <w:pPr>
+        <w:pStyle w:val="Heading1"/>
         <w:spacing w:before="160" w:after="80"/>
       </w:pPr>
       <w:r>
@@ -28,6 +30,7 @@
         <w:t>Part A  Key vocabulary</w:t>
       </w:r>
     </w:p>
+    <w:p/>
     <w:p>
       <w:pPr>
         <w:spacing w:after="80"/>
@@ -48,15 +51,14 @@
         <w:tblLook w:firstColumn="1" w:firstRow="1" w:lastColumn="0" w:lastRow="0" w:noHBand="0" w:noVBand="1" w:val="04A0"/>
       </w:tblPr>
       <w:tblGrid>
-        <w:gridCol w:w="2556"/>
-        <w:gridCol w:w="2556"/>
-        <w:gridCol w:w="2556"/>
-        <w:gridCol w:w="2556"/>
+        <w:gridCol w:w="3408"/>
+        <w:gridCol w:w="3408"/>
+        <w:gridCol w:w="3408"/>
       </w:tblGrid>
       <w:tr>
         <w:tc>
           <w:tcPr>
-            <w:tcW w:type="dxa" w:w="2556"/>
+            <w:tcW w:type="dxa" w:w="3408"/>
           </w:tcPr>
           <w:p>
             <w:r/>
@@ -72,7 +74,7 @@
         </w:tc>
         <w:tc>
           <w:tcPr>
-            <w:tcW w:type="dxa" w:w="2556"/>
+            <w:tcW w:type="dxa" w:w="3408"/>
           </w:tcPr>
           <w:p>
             <w:r/>
@@ -88,23 +90,7 @@
         </w:tc>
         <w:tc>
           <w:tcPr>
-            <w:tcW w:type="dxa" w:w="2556"/>
-          </w:tcPr>
-          <w:p>
-            <w:r/>
-            <w:r>
-              <w:rPr>
-                <w:b/>
-                <w:i w:val="0"/>
-                <w:sz w:val="22"/>
-              </w:rPr>
-              <w:t>Line</w:t>
-            </w:r>
-          </w:p>
-        </w:tc>
-        <w:tc>
-          <w:tcPr>
-            <w:tcW w:type="dxa" w:w="2556"/>
+            <w:tcW w:type="dxa" w:w="3408"/>
           </w:tcPr>
           <w:p>
             <w:r/>
@@ -122,7 +108,7 @@
       <w:tr>
         <w:tc>
           <w:tcPr>
-            <w:tcW w:type="dxa" w:w="2556"/>
+            <w:tcW w:type="dxa" w:w="3408"/>
           </w:tcPr>
           <w:p>
             <w:r/>
@@ -138,7 +124,7 @@
         </w:tc>
         <w:tc>
           <w:tcPr>
-            <w:tcW w:type="dxa" w:w="2556"/>
+            <w:tcW w:type="dxa" w:w="3408"/>
           </w:tcPr>
           <w:p>
             <w:r/>
@@ -148,13 +134,13 @@
                 <w:i w:val="0"/>
                 <w:sz w:val="22"/>
               </w:rPr>
-              <w:t>spectacle</w:t>
+              <w:t>spectacle (Line 1)</w:t>
             </w:r>
           </w:p>
         </w:tc>
         <w:tc>
           <w:tcPr>
-            <w:tcW w:type="dxa" w:w="2556"/>
+            <w:tcW w:type="dxa" w:w="3408"/>
           </w:tcPr>
           <w:p>
             <w:r/>
@@ -164,23 +150,6 @@
                 <w:i w:val="0"/>
                 <w:sz w:val="22"/>
               </w:rPr>
-              <w:t>Text 1, line 1</w:t>
-            </w:r>
-          </w:p>
-        </w:tc>
-        <w:tc>
-          <w:tcPr>
-            <w:tcW w:type="dxa" w:w="2556"/>
-          </w:tcPr>
-          <w:p>
-            <w:r/>
-            <w:r>
-              <w:rPr>
-                <w:b w:val="0"/>
-                <w:i w:val="0"/>
-                <w:sz w:val="22"/>
-              </w:rPr>
-              <w:t>_____</w:t>
             </w:r>
           </w:p>
         </w:tc>
@@ -188,7 +157,7 @@
       <w:tr>
         <w:tc>
           <w:tcPr>
-            <w:tcW w:type="dxa" w:w="2556"/>
+            <w:tcW w:type="dxa" w:w="3408"/>
           </w:tcPr>
           <w:p>
             <w:r/>
@@ -204,7 +173,7 @@
         </w:tc>
         <w:tc>
           <w:tcPr>
-            <w:tcW w:type="dxa" w:w="2556"/>
+            <w:tcW w:type="dxa" w:w="3408"/>
           </w:tcPr>
           <w:p>
             <w:r/>
@@ -214,13 +183,13 @@
                 <w:i w:val="0"/>
                 <w:sz w:val="22"/>
               </w:rPr>
-              <w:t>buried</w:t>
+              <w:t>buried (Line 2)</w:t>
             </w:r>
           </w:p>
         </w:tc>
         <w:tc>
           <w:tcPr>
-            <w:tcW w:type="dxa" w:w="2556"/>
+            <w:tcW w:type="dxa" w:w="3408"/>
           </w:tcPr>
           <w:p>
             <w:r/>
@@ -230,23 +199,6 @@
                 <w:i w:val="0"/>
                 <w:sz w:val="22"/>
               </w:rPr>
-              <w:t>Text 1, line 2</w:t>
-            </w:r>
-          </w:p>
-        </w:tc>
-        <w:tc>
-          <w:tcPr>
-            <w:tcW w:type="dxa" w:w="2556"/>
-          </w:tcPr>
-          <w:p>
-            <w:r/>
-            <w:r>
-              <w:rPr>
-                <w:b w:val="0"/>
-                <w:i w:val="0"/>
-                <w:sz w:val="22"/>
-              </w:rPr>
-              <w:t>_____</w:t>
             </w:r>
           </w:p>
         </w:tc>
@@ -254,7 +206,7 @@
       <w:tr>
         <w:tc>
           <w:tcPr>
-            <w:tcW w:type="dxa" w:w="2556"/>
+            <w:tcW w:type="dxa" w:w="3408"/>
           </w:tcPr>
           <w:p>
             <w:r/>
@@ -270,7 +222,7 @@
         </w:tc>
         <w:tc>
           <w:tcPr>
-            <w:tcW w:type="dxa" w:w="2556"/>
+            <w:tcW w:type="dxa" w:w="3408"/>
           </w:tcPr>
           <w:p>
             <w:r/>
@@ -280,13 +232,13 @@
                 <w:i w:val="0"/>
                 <w:sz w:val="22"/>
               </w:rPr>
-              <w:t>emperor</w:t>
+              <w:t>emperor (Line 3)</w:t>
             </w:r>
           </w:p>
         </w:tc>
         <w:tc>
           <w:tcPr>
-            <w:tcW w:type="dxa" w:w="2556"/>
+            <w:tcW w:type="dxa" w:w="3408"/>
           </w:tcPr>
           <w:p>
             <w:r/>
@@ -296,23 +248,6 @@
                 <w:i w:val="0"/>
                 <w:sz w:val="22"/>
               </w:rPr>
-              <w:t>Text 1, line 3</w:t>
-            </w:r>
-          </w:p>
-        </w:tc>
-        <w:tc>
-          <w:tcPr>
-            <w:tcW w:type="dxa" w:w="2556"/>
-          </w:tcPr>
-          <w:p>
-            <w:r/>
-            <w:r>
-              <w:rPr>
-                <w:b w:val="0"/>
-                <w:i w:val="0"/>
-                <w:sz w:val="22"/>
-              </w:rPr>
-              <w:t>_____</w:t>
             </w:r>
           </w:p>
         </w:tc>
@@ -320,7 +255,7 @@
       <w:tr>
         <w:tc>
           <w:tcPr>
-            <w:tcW w:type="dxa" w:w="2556"/>
+            <w:tcW w:type="dxa" w:w="3408"/>
           </w:tcPr>
           <w:p>
             <w:r/>
@@ -336,7 +271,7 @@
         </w:tc>
         <w:tc>
           <w:tcPr>
-            <w:tcW w:type="dxa" w:w="2556"/>
+            <w:tcW w:type="dxa" w:w="3408"/>
           </w:tcPr>
           <w:p>
             <w:r/>
@@ -346,13 +281,13 @@
                 <w:i w:val="0"/>
                 <w:sz w:val="22"/>
               </w:rPr>
-              <w:t>archaeologists</w:t>
+              <w:t>archaeologists (Line 3)</w:t>
             </w:r>
           </w:p>
         </w:tc>
         <w:tc>
           <w:tcPr>
-            <w:tcW w:type="dxa" w:w="2556"/>
+            <w:tcW w:type="dxa" w:w="3408"/>
           </w:tcPr>
           <w:p>
             <w:r/>
@@ -362,23 +297,6 @@
                 <w:i w:val="0"/>
                 <w:sz w:val="22"/>
               </w:rPr>
-              <w:t>Text 1, line 3</w:t>
-            </w:r>
-          </w:p>
-        </w:tc>
-        <w:tc>
-          <w:tcPr>
-            <w:tcW w:type="dxa" w:w="2556"/>
-          </w:tcPr>
-          <w:p>
-            <w:r/>
-            <w:r>
-              <w:rPr>
-                <w:b w:val="0"/>
-                <w:i w:val="0"/>
-                <w:sz w:val="22"/>
-              </w:rPr>
-              <w:t>_____</w:t>
             </w:r>
           </w:p>
         </w:tc>
@@ -386,7 +304,7 @@
       <w:tr>
         <w:tc>
           <w:tcPr>
-            <w:tcW w:type="dxa" w:w="2556"/>
+            <w:tcW w:type="dxa" w:w="3408"/>
           </w:tcPr>
           <w:p>
             <w:r/>
@@ -402,7 +320,7 @@
         </w:tc>
         <w:tc>
           <w:tcPr>
-            <w:tcW w:type="dxa" w:w="2556"/>
+            <w:tcW w:type="dxa" w:w="3408"/>
           </w:tcPr>
           <w:p>
             <w:r/>
@@ -412,13 +330,13 @@
                 <w:i w:val="0"/>
                 <w:sz w:val="22"/>
               </w:rPr>
-              <w:t>fragments</w:t>
+              <w:t>fragments (Line 22)</w:t>
             </w:r>
           </w:p>
         </w:tc>
         <w:tc>
           <w:tcPr>
-            <w:tcW w:type="dxa" w:w="2556"/>
+            <w:tcW w:type="dxa" w:w="3408"/>
           </w:tcPr>
           <w:p>
             <w:r/>
@@ -428,23 +346,6 @@
                 <w:i w:val="0"/>
                 <w:sz w:val="22"/>
               </w:rPr>
-              <w:t>Text 1, line 22</w:t>
-            </w:r>
-          </w:p>
-        </w:tc>
-        <w:tc>
-          <w:tcPr>
-            <w:tcW w:type="dxa" w:w="2556"/>
-          </w:tcPr>
-          <w:p>
-            <w:r/>
-            <w:r>
-              <w:rPr>
-                <w:b w:val="0"/>
-                <w:i w:val="0"/>
-                <w:sz w:val="22"/>
-              </w:rPr>
-              <w:t>_____</w:t>
             </w:r>
           </w:p>
         </w:tc>
@@ -452,7 +353,7 @@
       <w:tr>
         <w:tc>
           <w:tcPr>
-            <w:tcW w:type="dxa" w:w="2556"/>
+            <w:tcW w:type="dxa" w:w="3408"/>
           </w:tcPr>
           <w:p>
             <w:r/>
@@ -468,7 +369,7 @@
         </w:tc>
         <w:tc>
           <w:tcPr>
-            <w:tcW w:type="dxa" w:w="2556"/>
+            <w:tcW w:type="dxa" w:w="3408"/>
           </w:tcPr>
           <w:p>
             <w:r/>
@@ -478,13 +379,13 @@
                 <w:i w:val="0"/>
                 <w:sz w:val="22"/>
               </w:rPr>
-              <w:t>warriors</w:t>
+              <w:t>warriors (Line 28)</w:t>
             </w:r>
           </w:p>
         </w:tc>
         <w:tc>
           <w:tcPr>
-            <w:tcW w:type="dxa" w:w="2556"/>
+            <w:tcW w:type="dxa" w:w="3408"/>
           </w:tcPr>
           <w:p>
             <w:r/>
@@ -494,23 +395,6 @@
                 <w:i w:val="0"/>
                 <w:sz w:val="22"/>
               </w:rPr>
-              <w:t>Text 1, line 28</w:t>
-            </w:r>
-          </w:p>
-        </w:tc>
-        <w:tc>
-          <w:tcPr>
-            <w:tcW w:type="dxa" w:w="2556"/>
-          </w:tcPr>
-          <w:p>
-            <w:r/>
-            <w:r>
-              <w:rPr>
-                <w:b w:val="0"/>
-                <w:i w:val="0"/>
-                <w:sz w:val="22"/>
-              </w:rPr>
-              <w:t>_____</w:t>
             </w:r>
           </w:p>
         </w:tc>
@@ -518,7 +402,7 @@
       <w:tr>
         <w:tc>
           <w:tcPr>
-            <w:tcW w:type="dxa" w:w="2556"/>
+            <w:tcW w:type="dxa" w:w="3408"/>
           </w:tcPr>
           <w:p>
             <w:r/>
@@ -534,7 +418,7 @@
         </w:tc>
         <w:tc>
           <w:tcPr>
-            <w:tcW w:type="dxa" w:w="2556"/>
+            <w:tcW w:type="dxa" w:w="3408"/>
           </w:tcPr>
           <w:p>
             <w:r/>
@@ -544,13 +428,13 @@
                 <w:i w:val="0"/>
                 <w:sz w:val="22"/>
               </w:rPr>
-              <w:t>grandiose</w:t>
+              <w:t>grandiose (Line 36)</w:t>
             </w:r>
           </w:p>
         </w:tc>
         <w:tc>
           <w:tcPr>
-            <w:tcW w:type="dxa" w:w="2556"/>
+            <w:tcW w:type="dxa" w:w="3408"/>
           </w:tcPr>
           <w:p>
             <w:r/>
@@ -560,23 +444,6 @@
                 <w:i w:val="0"/>
                 <w:sz w:val="22"/>
               </w:rPr>
-              <w:t>Text 1, line 36</w:t>
-            </w:r>
-          </w:p>
-        </w:tc>
-        <w:tc>
-          <w:tcPr>
-            <w:tcW w:type="dxa" w:w="2556"/>
-          </w:tcPr>
-          <w:p>
-            <w:r/>
-            <w:r>
-              <w:rPr>
-                <w:b w:val="0"/>
-                <w:i w:val="0"/>
-                <w:sz w:val="22"/>
-              </w:rPr>
-              <w:t>_____</w:t>
             </w:r>
           </w:p>
         </w:tc>
@@ -584,7 +451,7 @@
       <w:tr>
         <w:tc>
           <w:tcPr>
-            <w:tcW w:type="dxa" w:w="2556"/>
+            <w:tcW w:type="dxa" w:w="3408"/>
           </w:tcPr>
           <w:p>
             <w:r/>
@@ -600,7 +467,7 @@
         </w:tc>
         <w:tc>
           <w:tcPr>
-            <w:tcW w:type="dxa" w:w="2556"/>
+            <w:tcW w:type="dxa" w:w="3408"/>
           </w:tcPr>
           <w:p>
             <w:r/>
@@ -610,13 +477,13 @@
                 <w:i w:val="0"/>
                 <w:sz w:val="22"/>
               </w:rPr>
-              <w:t>serendipity</w:t>
+              <w:t>serendipity (Line 62)</w:t>
             </w:r>
           </w:p>
         </w:tc>
         <w:tc>
           <w:tcPr>
-            <w:tcW w:type="dxa" w:w="2556"/>
+            <w:tcW w:type="dxa" w:w="3408"/>
           </w:tcPr>
           <w:p>
             <w:r/>
@@ -626,23 +493,6 @@
                 <w:i w:val="0"/>
                 <w:sz w:val="22"/>
               </w:rPr>
-              <w:t>Text 1, line 62</w:t>
-            </w:r>
-          </w:p>
-        </w:tc>
-        <w:tc>
-          <w:tcPr>
-            <w:tcW w:type="dxa" w:w="2556"/>
-          </w:tcPr>
-          <w:p>
-            <w:r/>
-            <w:r>
-              <w:rPr>
-                <w:b w:val="0"/>
-                <w:i w:val="0"/>
-                <w:sz w:val="22"/>
-              </w:rPr>
-              <w:t>_____</w:t>
             </w:r>
           </w:p>
         </w:tc>
@@ -650,7 +500,7 @@
       <w:tr>
         <w:tc>
           <w:tcPr>
-            <w:tcW w:type="dxa" w:w="2556"/>
+            <w:tcW w:type="dxa" w:w="3408"/>
           </w:tcPr>
           <w:p>
             <w:r/>
@@ -666,7 +516,7 @@
         </w:tc>
         <w:tc>
           <w:tcPr>
-            <w:tcW w:type="dxa" w:w="2556"/>
+            <w:tcW w:type="dxa" w:w="3408"/>
           </w:tcPr>
           <w:p>
             <w:r/>
@@ -676,13 +526,13 @@
                 <w:i w:val="0"/>
                 <w:sz w:val="22"/>
               </w:rPr>
-              <w:t>excavation</w:t>
+              <w:t>excavation (Line 65)</w:t>
             </w:r>
           </w:p>
         </w:tc>
         <w:tc>
           <w:tcPr>
-            <w:tcW w:type="dxa" w:w="2556"/>
+            <w:tcW w:type="dxa" w:w="3408"/>
           </w:tcPr>
           <w:p>
             <w:r/>
@@ -692,23 +542,6 @@
                 <w:i w:val="0"/>
                 <w:sz w:val="22"/>
               </w:rPr>
-              <w:t>Text 1, line 65</w:t>
-            </w:r>
-          </w:p>
-        </w:tc>
-        <w:tc>
-          <w:tcPr>
-            <w:tcW w:type="dxa" w:w="2556"/>
-          </w:tcPr>
-          <w:p>
-            <w:r/>
-            <w:r>
-              <w:rPr>
-                <w:b w:val="0"/>
-                <w:i w:val="0"/>
-                <w:sz w:val="22"/>
-              </w:rPr>
-              <w:t>_____</w:t>
             </w:r>
           </w:p>
         </w:tc>
@@ -716,7 +549,7 @@
       <w:tr>
         <w:tc>
           <w:tcPr>
-            <w:tcW w:type="dxa" w:w="2556"/>
+            <w:tcW w:type="dxa" w:w="3408"/>
           </w:tcPr>
           <w:p>
             <w:r/>
@@ -732,7 +565,7 @@
         </w:tc>
         <w:tc>
           <w:tcPr>
-            <w:tcW w:type="dxa" w:w="2556"/>
+            <w:tcW w:type="dxa" w:w="3408"/>
           </w:tcPr>
           <w:p>
             <w:r/>
@@ -742,13 +575,13 @@
                 <w:i w:val="0"/>
                 <w:sz w:val="22"/>
               </w:rPr>
-              <w:t>remnants</w:t>
+              <w:t>remnants (Line 91)</w:t>
             </w:r>
           </w:p>
         </w:tc>
         <w:tc>
           <w:tcPr>
-            <w:tcW w:type="dxa" w:w="2556"/>
+            <w:tcW w:type="dxa" w:w="3408"/>
           </w:tcPr>
           <w:p>
             <w:r/>
@@ -758,23 +591,6 @@
                 <w:i w:val="0"/>
                 <w:sz w:val="22"/>
               </w:rPr>
-              <w:t>Text 1, line 91</w:t>
-            </w:r>
-          </w:p>
-        </w:tc>
-        <w:tc>
-          <w:tcPr>
-            <w:tcW w:type="dxa" w:w="2556"/>
-          </w:tcPr>
-          <w:p>
-            <w:r/>
-            <w:r>
-              <w:rPr>
-                <w:b w:val="0"/>
-                <w:i w:val="0"/>
-                <w:sz w:val="22"/>
-              </w:rPr>
-              <w:t>_____</w:t>
             </w:r>
           </w:p>
         </w:tc>
@@ -805,6 +621,72 @@
                 <w:i w:val="0"/>
                 <w:sz w:val="22"/>
               </w:rPr>
+              <w:t>Letter</w:t>
+            </w:r>
+          </w:p>
+        </w:tc>
+        <w:tc>
+          <w:tcPr>
+            <w:tcW w:type="dxa" w:w="2556"/>
+          </w:tcPr>
+          <w:p>
+            <w:r/>
+            <w:r>
+              <w:rPr>
+                <w:b/>
+                <w:i w:val="0"/>
+                <w:sz w:val="22"/>
+              </w:rPr>
+              <w:t>Definition</w:t>
+            </w:r>
+          </w:p>
+        </w:tc>
+        <w:tc>
+          <w:tcPr>
+            <w:tcW w:type="dxa" w:w="2556"/>
+          </w:tcPr>
+          <w:p>
+            <w:r/>
+            <w:r>
+              <w:rPr>
+                <w:b/>
+                <w:i w:val="0"/>
+                <w:sz w:val="22"/>
+              </w:rPr>
+              <w:t>Letter</w:t>
+            </w:r>
+          </w:p>
+        </w:tc>
+        <w:tc>
+          <w:tcPr>
+            <w:tcW w:type="dxa" w:w="2556"/>
+          </w:tcPr>
+          <w:p>
+            <w:r/>
+            <w:r>
+              <w:rPr>
+                <w:b/>
+                <w:i w:val="0"/>
+                <w:sz w:val="22"/>
+              </w:rPr>
+              <w:t>Definition</w:t>
+            </w:r>
+          </w:p>
+        </w:tc>
+      </w:tr>
+      <w:tr>
+        <w:tc>
+          <w:tcPr>
+            <w:tcW w:type="dxa" w:w="2556"/>
+          </w:tcPr>
+          <w:p>
+            <w:r/>
+            <w:r>
+              <w:rPr>
+                <w:b/>
+                <w:i w:val="0"/>
+                <w:sz w:val="22"/>
+              </w:rPr>
               <w:t>A</w:t>
             </w:r>
           </w:p>
@@ -821,7 +703,7 @@
                 <w:i w:val="0"/>
                 <w:sz w:val="22"/>
               </w:rPr>
-              <w:t>a king who rules a large country (an empire)</w:t>
+              <w:t>A king who rules a large country (an empire).</w:t>
             </w:r>
           </w:p>
         </w:tc>
@@ -853,7 +735,7 @@
                 <w:i w:val="0"/>
                 <w:sz w:val="22"/>
               </w:rPr>
-              <w:t>small parts that are left over; remains</w:t>
+              <w:t>Small parts that are left over; remains.</w:t>
             </w:r>
           </w:p>
         </w:tc>
@@ -887,7 +769,7 @@
                 <w:i w:val="0"/>
                 <w:sz w:val="22"/>
               </w:rPr>
-              <w:t>small broken pieces of something</w:t>
+              <w:t>Small broken pieces of something.</w:t>
             </w:r>
           </w:p>
         </w:tc>
@@ -919,7 +801,7 @@
                 <w:i w:val="0"/>
                 <w:sz w:val="22"/>
               </w:rPr>
-              <w:t>good luck; finding something good by chance</w:t>
+              <w:t>Good luck; finding something good by chance.</w:t>
             </w:r>
           </w:p>
         </w:tc>
@@ -953,7 +835,7 @@
                 <w:i w:val="0"/>
                 <w:sz w:val="22"/>
               </w:rPr>
-              <w:t>an exciting show or scene that you watch</w:t>
+              <w:t>An exciting show or scene that you watch.</w:t>
             </w:r>
           </w:p>
         </w:tc>
@@ -985,7 +867,7 @@
                 <w:i w:val="0"/>
                 <w:sz w:val="22"/>
               </w:rPr>
-              <w:t>very grand and impressive; bigger than necessary</w:t>
+              <w:t>Very grand and impressive; bigger than necessary.</w:t>
             </w:r>
           </w:p>
         </w:tc>
@@ -1019,7 +901,7 @@
                 <w:i w:val="0"/>
                 <w:sz w:val="22"/>
               </w:rPr>
-              <w:t>digging in the ground to find old things</w:t>
+              <w:t>Digging in the ground to find old things.</w:t>
             </w:r>
           </w:p>
         </w:tc>
@@ -1051,7 +933,7 @@
                 <w:i w:val="0"/>
                 <w:sz w:val="22"/>
               </w:rPr>
-              <w:t>soldiers who fight in battles</w:t>
+              <w:t>Soldiers who fight in battles.</w:t>
             </w:r>
           </w:p>
         </w:tc>
@@ -1085,7 +967,7 @@
                 <w:i w:val="0"/>
                 <w:sz w:val="22"/>
               </w:rPr>
-              <w:t>put underground; covered with earth</w:t>
+              <w:t>Put underground; covered with earth.</w:t>
             </w:r>
           </w:p>
         </w:tc>
@@ -1117,7 +999,7 @@
                 <w:i w:val="0"/>
                 <w:sz w:val="22"/>
               </w:rPr>
-              <w:t>scientists who study old things found in the ground</w:t>
+              <w:t>Scientists who study old things found in the ground.</w:t>
             </w:r>
           </w:p>
         </w:tc>
@@ -1125,6 +1007,7 @@
     </w:tbl>
     <w:p>
       <w:pPr>
+        <w:pStyle w:val="Heading1"/>
         <w:spacing w:before="160" w:after="80"/>
       </w:pPr>
       <w:r>
@@ -1245,6 +1128,7 @@
     </w:p>
     <w:p>
       <w:pPr>
+        <w:pStyle w:val="Heading1"/>
         <w:spacing w:before="160" w:after="80"/>
       </w:pPr>
       <w:r>
@@ -1253,7 +1137,7 @@
           <w:i w:val="0"/>
           <w:sz w:val="22"/>
         </w:rPr>
-        <w:t>Part C  Reading questions</w:t>
+        <w:t>Part C  Open-ended questions [Reference / Reasons &amp; Purposes / Word-finding / Gap-filling]</w:t>
       </w:r>
     </w:p>
     <w:p>
@@ -1271,331 +1155,224 @@
     </w:p>
     <w:p>
       <w:pPr>
+        <w:pStyle w:val="ListParagraph"/>
         <w:spacing w:after="0"/>
       </w:pPr>
       <w:r>
         <w:rPr>
-          <w:b/>
+          <w:b w:val="0"/>
           <w:i w:val="0"/>
           <w:sz w:val="22"/>
         </w:rPr>
-        <w:t xml:space="preserve">1. </w:t>
       </w:r>
       <w:r>
         <w:rPr>
-          <w:b/>
-          <w:i w:val="0"/>
           <w:sz w:val="22"/>
         </w:rPr>
         <w:t>What does ‘the task’ (line 23) refer to?</w:t>
+        <w:br/>
+      </w:r>
+      <w:r>
+        <w:rPr>
+          <w:sz w:val="22"/>
+        </w:rPr>
+        <w:t>________________________________________</w:t>
       </w:r>
     </w:p>
     <w:p>
       <w:pPr>
-        <w:spacing w:before="40" w:after="40"/>
-        <w:pBdr>
-          <w:bottom w:val="single" w:sz="8" w:space="1" w:color="808080"/>
-        </w:pBdr>
-      </w:pPr>
-    </w:p>
-    <w:p>
-      <w:pPr>
-        <w:spacing w:before="40" w:after="40"/>
-        <w:pBdr>
-          <w:bottom w:val="single" w:sz="8" w:space="1" w:color="808080"/>
-        </w:pBdr>
-      </w:pPr>
-    </w:p>
-    <w:p>
-      <w:pPr>
-        <w:spacing w:before="40" w:after="40"/>
-        <w:pBdr>
-          <w:bottom w:val="single" w:sz="8" w:space="1" w:color="808080"/>
-        </w:pBdr>
-      </w:pPr>
-    </w:p>
-    <w:p>
-      <w:pPr>
+        <w:pStyle w:val="ListParagraph"/>
         <w:spacing w:after="0"/>
       </w:pPr>
       <w:r>
         <w:rPr>
-          <w:b/>
+          <w:b w:val="0"/>
           <w:i w:val="0"/>
           <w:sz w:val="22"/>
         </w:rPr>
-        <w:t xml:space="preserve">2. </w:t>
       </w:r>
       <w:r>
         <w:rPr>
-          <w:b/>
-          <w:i w:val="0"/>
           <w:sz w:val="22"/>
         </w:rPr>
         <w:t>According to paragraph 3, what were the farmers doing when they first discovered the terra-cotta warriors?</w:t>
+        <w:br/>
+      </w:r>
+      <w:r>
+        <w:rPr>
+          <w:sz w:val="22"/>
+        </w:rPr>
+        <w:t>___________________________________________________________________________</w:t>
       </w:r>
     </w:p>
     <w:p>
       <w:pPr>
-        <w:spacing w:before="40" w:after="40"/>
-        <w:pBdr>
-          <w:bottom w:val="single" w:sz="8" w:space="1" w:color="808080"/>
-        </w:pBdr>
-      </w:pPr>
-    </w:p>
-    <w:p>
-      <w:pPr>
-        <w:spacing w:before="40" w:after="40"/>
-        <w:pBdr>
-          <w:bottom w:val="single" w:sz="8" w:space="1" w:color="808080"/>
-        </w:pBdr>
-      </w:pPr>
-    </w:p>
-    <w:p>
-      <w:pPr>
-        <w:spacing w:before="40" w:after="40"/>
-        <w:pBdr>
-          <w:bottom w:val="single" w:sz="8" w:space="1" w:color="808080"/>
-        </w:pBdr>
-      </w:pPr>
-    </w:p>
-    <w:p>
-      <w:pPr>
+        <w:pStyle w:val="ListParagraph"/>
         <w:spacing w:after="0"/>
       </w:pPr>
       <w:r>
         <w:rPr>
-          <w:b/>
+          <w:b w:val="0"/>
           <w:i w:val="0"/>
           <w:sz w:val="22"/>
         </w:rPr>
-        <w:t xml:space="preserve">3. </w:t>
       </w:r>
       <w:r>
         <w:rPr>
-          <w:b/>
-          <w:i w:val="0"/>
           <w:sz w:val="22"/>
         </w:rPr>
         <w:t>Find a word in paragraph 4 that means ‘not colorful’.</w:t>
+        <w:br/>
+      </w:r>
+      <w:r>
+        <w:rPr>
+          <w:sz w:val="22"/>
+        </w:rPr>
+        <w:t>________________________________</w:t>
       </w:r>
     </w:p>
     <w:p>
       <w:pPr>
-        <w:spacing w:before="40" w:after="40"/>
-        <w:pBdr>
-          <w:bottom w:val="single" w:sz="8" w:space="1" w:color="808080"/>
-        </w:pBdr>
-      </w:pPr>
-    </w:p>
-    <w:p>
-      <w:pPr>
+        <w:pStyle w:val="ListParagraph"/>
         <w:spacing w:after="0"/>
       </w:pPr>
       <w:r>
         <w:rPr>
-          <w:b/>
+          <w:b w:val="0"/>
           <w:i w:val="0"/>
           <w:sz w:val="22"/>
         </w:rPr>
-        <w:t xml:space="preserve">4. </w:t>
       </w:r>
       <w:r>
         <w:rPr>
-          <w:b/>
-          <w:i w:val="0"/>
           <w:sz w:val="22"/>
         </w:rPr>
         <w:t>According to paragraph 5, why did the colors of the warriors not survive?</w:t>
+        <w:br/>
+      </w:r>
+      <w:r>
+        <w:rPr>
+          <w:sz w:val="22"/>
+        </w:rPr>
+        <w:t>___________________________________________________________________________</w:t>
       </w:r>
     </w:p>
     <w:p>
       <w:pPr>
-        <w:spacing w:before="40" w:after="40"/>
-        <w:pBdr>
-          <w:bottom w:val="single" w:sz="8" w:space="1" w:color="808080"/>
-        </w:pBdr>
-      </w:pPr>
-    </w:p>
-    <w:p>
-      <w:pPr>
-        <w:spacing w:before="40" w:after="40"/>
-        <w:pBdr>
-          <w:bottom w:val="single" w:sz="8" w:space="1" w:color="808080"/>
-        </w:pBdr>
-      </w:pPr>
-    </w:p>
-    <w:p>
-      <w:pPr>
-        <w:spacing w:before="40" w:after="40"/>
-        <w:pBdr>
-          <w:bottom w:val="single" w:sz="8" w:space="1" w:color="808080"/>
-        </w:pBdr>
-      </w:pPr>
-    </w:p>
-    <w:p>
-      <w:pPr>
+        <w:pStyle w:val="ListParagraph"/>
         <w:spacing w:after="0"/>
       </w:pPr>
       <w:r>
         <w:rPr>
-          <w:b/>
+          <w:b w:val="0"/>
           <w:i w:val="0"/>
           <w:sz w:val="22"/>
         </w:rPr>
-        <w:t xml:space="preserve">5. </w:t>
       </w:r>
       <w:r>
         <w:rPr>
-          <w:b/>
-          <w:i w:val="0"/>
           <w:sz w:val="22"/>
         </w:rPr>
         <w:t>In line 61, the writer mentions boiling an egg to show…</w:t>
+        <w:br/>
+      </w:r>
+      <w:r>
+        <w:rPr>
+          <w:sz w:val="22"/>
+        </w:rPr>
+        <w:t>___________________________________________________________________________</w:t>
       </w:r>
     </w:p>
     <w:p>
       <w:pPr>
-        <w:spacing w:before="40" w:after="40"/>
-        <w:pBdr>
-          <w:bottom w:val="single" w:sz="8" w:space="1" w:color="808080"/>
-        </w:pBdr>
-      </w:pPr>
-    </w:p>
-    <w:p>
-      <w:pPr>
-        <w:spacing w:before="40" w:after="40"/>
-        <w:pBdr>
-          <w:bottom w:val="single" w:sz="8" w:space="1" w:color="808080"/>
-        </w:pBdr>
-      </w:pPr>
-    </w:p>
-    <w:p>
-      <w:pPr>
+        <w:pStyle w:val="ListParagraph"/>
         <w:spacing w:after="0"/>
       </w:pPr>
       <w:r>
         <w:rPr>
-          <w:b/>
+          <w:b w:val="0"/>
           <w:i w:val="0"/>
           <w:sz w:val="22"/>
         </w:rPr>
-        <w:t xml:space="preserve">6. </w:t>
       </w:r>
       <w:r>
         <w:rPr>
-          <w:b/>
-          <w:i w:val="0"/>
           <w:sz w:val="22"/>
         </w:rPr>
         <w:t>Who developed PEG (line 76)?</w:t>
+        <w:br/>
+      </w:r>
+      <w:r>
+        <w:rPr>
+          <w:sz w:val="22"/>
+        </w:rPr>
+        <w:t>_____________________________________________</w:t>
       </w:r>
     </w:p>
     <w:p>
       <w:pPr>
-        <w:spacing w:before="40" w:after="40"/>
-        <w:pBdr>
-          <w:bottom w:val="single" w:sz="8" w:space="1" w:color="808080"/>
-        </w:pBdr>
-      </w:pPr>
-    </w:p>
-    <w:p>
-      <w:pPr>
-        <w:spacing w:before="40" w:after="40"/>
-        <w:pBdr>
-          <w:bottom w:val="single" w:sz="8" w:space="1" w:color="808080"/>
-        </w:pBdr>
-      </w:pPr>
-    </w:p>
-    <w:p>
-      <w:pPr>
+        <w:pStyle w:val="ListParagraph"/>
         <w:spacing w:after="0"/>
       </w:pPr>
       <w:r>
         <w:rPr>
-          <w:b/>
+          <w:b w:val="0"/>
           <w:i w:val="0"/>
           <w:sz w:val="22"/>
         </w:rPr>
-        <w:t xml:space="preserve">7. </w:t>
       </w:r>
       <w:r>
         <w:rPr>
-          <w:b/>
-          <w:i w:val="0"/>
           <w:sz w:val="22"/>
         </w:rPr>
         <w:t>What is the purpose of wrapping the artifact in plastic?</w:t>
+        <w:br/>
+      </w:r>
+      <w:r>
+        <w:rPr>
+          <w:sz w:val="22"/>
+        </w:rPr>
+        <w:t>___________________________________________________________________________</w:t>
       </w:r>
     </w:p>
     <w:p>
       <w:pPr>
-        <w:spacing w:before="40" w:after="40"/>
-        <w:pBdr>
-          <w:bottom w:val="single" w:sz="8" w:space="1" w:color="808080"/>
-        </w:pBdr>
-      </w:pPr>
-    </w:p>
-    <w:p>
-      <w:pPr>
-        <w:spacing w:before="40" w:after="40"/>
-        <w:pBdr>
-          <w:bottom w:val="single" w:sz="8" w:space="1" w:color="808080"/>
-        </w:pBdr>
-      </w:pPr>
-    </w:p>
-    <w:p>
-      <w:pPr>
-        <w:spacing w:before="40" w:after="40"/>
-        <w:pBdr>
-          <w:bottom w:val="single" w:sz="8" w:space="1" w:color="808080"/>
-        </w:pBdr>
-      </w:pPr>
-    </w:p>
-    <w:p>
-      <w:pPr>
+        <w:pStyle w:val="ListParagraph"/>
         <w:spacing w:after="0"/>
       </w:pPr>
       <w:r>
         <w:rPr>
-          <w:b/>
+          <w:b w:val="0"/>
           <w:i w:val="0"/>
           <w:sz w:val="22"/>
         </w:rPr>
-        <w:t xml:space="preserve">8. </w:t>
       </w:r>
       <w:r>
         <w:rPr>
-          <w:b/>
-          <w:i w:val="0"/>
           <w:sz w:val="22"/>
         </w:rPr>
         <w:t>According to Rong Bo, why should the earth be treated like an artifact (lines 112–113)?</w:t>
+        <w:br/>
+      </w:r>
+      <w:r>
+        <w:rPr>
+          <w:sz w:val="22"/>
+        </w:rPr>
+        <w:t>___________________________________________________________________________</w:t>
       </w:r>
     </w:p>
     <w:p>
       <w:pPr>
-        <w:spacing w:before="40" w:after="40"/>
-        <w:pBdr>
-          <w:bottom w:val="single" w:sz="8" w:space="1" w:color="808080"/>
-        </w:pBdr>
+        <w:spacing w:after="40"/>
       </w:pPr>
-    </w:p>
-    <w:p>
-      <w:pPr>
-        <w:spacing w:before="40" w:after="40"/>
-        <w:pBdr>
-          <w:bottom w:val="single" w:sz="8" w:space="1" w:color="808080"/>
-        </w:pBdr>
-      </w:pPr>
-    </w:p>
-    <w:p>
-      <w:pPr>
-        <w:spacing w:before="40" w:after="40"/>
-        <w:pBdr>
-          <w:bottom w:val="single" w:sz="8" w:space="1" w:color="808080"/>
-        </w:pBdr>
-      </w:pPr>
+      <w:r>
+        <w:rPr>
+          <w:b w:val="0"/>
+          <w:i w:val="0"/>
+          <w:sz w:val="22"/>
+        </w:rPr>
+        <w:t>Use ONE word to complete each blank. You should make sure that your answers are grammatically correct, paying attention to word form, plurals, etc.</w:t>
+      </w:r>
     </w:p>
     <w:p>
       <w:pPr>
@@ -1603,125 +1380,16 @@
       </w:pPr>
       <w:r>
         <w:rPr>
-          <w:b/>
+          <w:b w:val="0"/>
           <w:i w:val="0"/>
           <w:sz w:val="22"/>
         </w:rPr>
-        <w:t xml:space="preserve">9. </w:t>
-      </w:r>
-      <w:r>
-        <w:rPr>
-          <w:b/>
-          <w:i w:val="0"/>
-          <w:sz w:val="22"/>
-        </w:rPr>
-        <w:t>Based on the information in paragraph 10, complete the following text by writing ONE word to fill in each blank. You should make sure that your answers are grammatically correct, paying attention to word form, plurals, etc.</w:t>
+        <w:t>The next challenge for (i) ______________  is to (ii) ______________  a procedure for (iii) ______________  color to the warriors now that a (iv) ______________  has been developed to hold together the soil.  (4 marks)</w:t>
       </w:r>
     </w:p>
     <w:p>
       <w:pPr>
-        <w:spacing w:after="160"/>
-      </w:pPr>
-      <w:r>
-        <w:rPr>
-          <w:b w:val="0"/>
-          <w:i w:val="0"/>
-          <w:sz w:val="22"/>
-        </w:rPr>
-        <w:t xml:space="preserve">The next challenge for </w:t>
-      </w:r>
-      <w:r>
-        <w:rPr>
-          <w:b/>
-          <w:i w:val="0"/>
-          <w:sz w:val="22"/>
-        </w:rPr>
-        <w:t>(i) ______________</w:t>
-      </w:r>
-      <w:r>
-        <w:rPr>
-          <w:b w:val="0"/>
-          <w:i w:val="0"/>
-          <w:sz w:val="22"/>
-        </w:rPr>
-        <w:t xml:space="preserve"> is to </w:t>
-      </w:r>
-      <w:r>
-        <w:rPr>
-          <w:b/>
-          <w:i w:val="0"/>
-          <w:sz w:val="22"/>
-        </w:rPr>
-        <w:t>(ii) ______________</w:t>
-      </w:r>
-      <w:r>
-        <w:rPr>
-          <w:b w:val="0"/>
-          <w:i w:val="0"/>
-          <w:sz w:val="22"/>
-        </w:rPr>
-        <w:t xml:space="preserve"> a procedure for </w:t>
-      </w:r>
-      <w:r>
-        <w:rPr>
-          <w:b/>
-          <w:i w:val="0"/>
-          <w:sz w:val="22"/>
-        </w:rPr>
-        <w:t>(iii) ______________</w:t>
-      </w:r>
-      <w:r>
-        <w:rPr>
-          <w:b w:val="0"/>
-          <w:i w:val="0"/>
-          <w:sz w:val="22"/>
-        </w:rPr>
-        <w:t xml:space="preserve"> color to the warriors now that a </w:t>
-      </w:r>
-      <w:r>
-        <w:rPr>
-          <w:b/>
-          <w:i w:val="0"/>
-          <w:sz w:val="22"/>
-        </w:rPr>
-        <w:t>(iv) ______________</w:t>
-      </w:r>
-      <w:r>
-        <w:rPr>
-          <w:b w:val="0"/>
-          <w:i w:val="0"/>
-          <w:sz w:val="22"/>
-        </w:rPr>
-        <w:t xml:space="preserve"> has been developed to hold together the soil.  </w:t>
-      </w:r>
-      <w:r>
-        <w:rPr>
-          <w:b w:val="0"/>
-          <w:i w:val="0"/>
-          <w:sz w:val="22"/>
-        </w:rPr>
-        <w:t>(4 marks)</w:t>
-      </w:r>
-    </w:p>
-    <w:p>
-      <w:pPr>
-        <w:spacing w:before="40" w:after="40"/>
-        <w:pBdr>
-          <w:bottom w:val="single" w:sz="8" w:space="1" w:color="808080"/>
-        </w:pBdr>
-      </w:pPr>
-    </w:p>
-    <w:p>
-      <w:pPr>
-        <w:spacing w:before="40" w:after="40"/>
-        <w:pBdr>
-          <w:bottom w:val="single" w:sz="8" w:space="1" w:color="808080"/>
-        </w:pBdr>
-      </w:pPr>
-    </w:p>
-    <w:p>
-      <w:pPr>
-        <w:spacing w:before="160" w:after="0"/>
+        <w:spacing w:before="200" w:after="0"/>
       </w:pPr>
       <w:r>
         <w:rPr>
@@ -1737,7 +1405,7 @@
           <w:i w:val="0"/>
           <w:sz w:val="22"/>
         </w:rPr>
-        <w:t>_____ / 12</w:t>
+        <w:t xml:space="preserve"> _____ / 12</w:t>
       </w:r>
     </w:p>
     <w:sectPr>

</xml_diff>

<commit_message>
Student handout: gap before tips, questions on new page, numbered questions
</commit_message>
<xml_diff>
--- a/F6_SP_Lesson_4_2013_Part_A_Open-Ended_Student_Version.docx
+++ b/F6_SP_Lesson_4_2013_Part_A_Open-Ended_Student_Version.docx
@@ -1007,6 +1007,30 @@
     </w:tbl>
     <w:p>
       <w:pPr>
+        <w:spacing w:after="40"/>
+      </w:pPr>
+      <w:r>
+        <w:rPr>
+          <w:b w:val="0"/>
+          <w:i w:val="0"/>
+          <w:sz w:val="22"/>
+        </w:rPr>
+      </w:r>
+    </w:p>
+    <w:p>
+      <w:pPr>
+        <w:spacing w:after="40"/>
+      </w:pPr>
+      <w:r>
+        <w:rPr>
+          <w:b w:val="0"/>
+          <w:i w:val="0"/>
+          <w:sz w:val="22"/>
+        </w:rPr>
+      </w:r>
+    </w:p>
+    <w:p>
+      <w:pPr>
         <w:pStyle w:val="Heading1"/>
         <w:spacing w:before="160" w:after="80"/>
       </w:pPr>
@@ -1129,6 +1153,7 @@
     <w:p>
       <w:pPr>
         <w:pStyle w:val="Heading1"/>
+        <w:pageBreakBefore/>
         <w:spacing w:before="160" w:after="80"/>
       </w:pPr>
       <w:r>
@@ -1169,7 +1194,7 @@
         <w:rPr>
           <w:sz w:val="22"/>
         </w:rPr>
-        <w:t>What does ‘the task’ (line 23) refer to?</w:t>
+        <w:t>1. What does ‘the task’ (line 23) refer to?</w:t>
         <w:br/>
       </w:r>
       <w:r>
@@ -1195,7 +1220,7 @@
         <w:rPr>
           <w:sz w:val="22"/>
         </w:rPr>
-        <w:t>According to paragraph 3, what were the farmers doing when they first discovered the terra-cotta warriors?</w:t>
+        <w:t>2. According to paragraph 3, what were the farmers doing when they first discovered the terra-cotta warriors?</w:t>
         <w:br/>
       </w:r>
       <w:r>
@@ -1221,7 +1246,7 @@
         <w:rPr>
           <w:sz w:val="22"/>
         </w:rPr>
-        <w:t>Find a word in paragraph 4 that means ‘not colorful’.</w:t>
+        <w:t>3. Find a word in paragraph 4 that means ‘not colorful’.</w:t>
         <w:br/>
       </w:r>
       <w:r>
@@ -1247,7 +1272,7 @@
         <w:rPr>
           <w:sz w:val="22"/>
         </w:rPr>
-        <w:t>According to paragraph 5, why did the colors of the warriors not survive?</w:t>
+        <w:t>4. According to paragraph 5, why did the colors of the warriors not survive?</w:t>
         <w:br/>
       </w:r>
       <w:r>
@@ -1273,7 +1298,7 @@
         <w:rPr>
           <w:sz w:val="22"/>
         </w:rPr>
-        <w:t>In line 61, the writer mentions boiling an egg to show…</w:t>
+        <w:t>5. In line 61, the writer mentions boiling an egg to show…</w:t>
         <w:br/>
       </w:r>
       <w:r>
@@ -1299,7 +1324,7 @@
         <w:rPr>
           <w:sz w:val="22"/>
         </w:rPr>
-        <w:t>Who developed PEG (line 76)?</w:t>
+        <w:t>6. Who developed PEG (line 76)?</w:t>
         <w:br/>
       </w:r>
       <w:r>
@@ -1325,7 +1350,7 @@
         <w:rPr>
           <w:sz w:val="22"/>
         </w:rPr>
-        <w:t>What is the purpose of wrapping the artifact in plastic?</w:t>
+        <w:t>7. What is the purpose of wrapping the artifact in plastic?</w:t>
         <w:br/>
       </w:r>
       <w:r>
@@ -1351,7 +1376,7 @@
         <w:rPr>
           <w:sz w:val="22"/>
         </w:rPr>
-        <w:t>According to Rong Bo, why should the earth be treated like an artifact (lines 112–113)?</w:t>
+        <w:t>8. According to Rong Bo, why should the earth be treated like an artifact (lines 112–113)?</w:t>
         <w:br/>
       </w:r>
       <w:r>
@@ -1365,6 +1390,14 @@
       <w:pPr>
         <w:spacing w:after="40"/>
       </w:pPr>
+      <w:r>
+        <w:rPr>
+          <w:b/>
+          <w:i w:val="0"/>
+          <w:sz w:val="22"/>
+        </w:rPr>
+        <w:t xml:space="preserve">9. </w:t>
+      </w:r>
       <w:r>
         <w:rPr>
           <w:b w:val="0"/>

</xml_diff>

<commit_message>
Student handout: replicate Helen's final format (tips in 2x1 Table Grid, gapped Q9 in 1x1 table, (4 marks) on instruction line, empty P between tables)
</commit_message>
<xml_diff>
--- a/F6_SP_Lesson_4_2013_Part_A_Open-Ended_Student_Version.docx
+++ b/F6_SP_Lesson_4_2013_Part_A_Open-Ended_Student_Version.docx
@@ -30,7 +30,6 @@
         <w:t>Part A  Key vocabulary</w:t>
       </w:r>
     </w:p>
-    <w:p/>
     <w:p>
       <w:pPr>
         <w:spacing w:after="80"/>
@@ -596,6 +595,18 @@
         </w:tc>
       </w:tr>
     </w:tbl>
+    <w:p>
+      <w:pPr>
+        <w:spacing w:after="40"/>
+      </w:pPr>
+      <w:r>
+        <w:rPr>
+          <w:b w:val="0"/>
+          <w:i w:val="0"/>
+          <w:sz w:val="22"/>
+        </w:rPr>
+      </w:r>
+    </w:p>
     <w:tbl>
       <w:tblPr>
         <w:tblStyle w:val="TableGrid"/>
@@ -1019,18 +1030,6 @@
     </w:p>
     <w:p>
       <w:pPr>
-        <w:spacing w:after="40"/>
-      </w:pPr>
-      <w:r>
-        <w:rPr>
-          <w:b w:val="0"/>
-          <w:i w:val="0"/>
-          <w:sz w:val="22"/>
-        </w:rPr>
-      </w:r>
-    </w:p>
-    <w:p>
-      <w:pPr>
         <w:pStyle w:val="Heading1"/>
         <w:spacing w:before="160" w:after="80"/>
       </w:pPr>
@@ -1040,116 +1039,119 @@
           <w:i w:val="0"/>
           <w:sz w:val="22"/>
         </w:rPr>
-        <w:t>Part B  Tips — important words to look for</w:t>
+        <w:t>Part B  Tips — important clues to look for</w:t>
       </w:r>
     </w:p>
-    <w:p>
-      <w:pPr>
-        <w:spacing w:after="80"/>
-      </w:pPr>
-      <w:r>
-        <w:rPr>
-          <w:b w:val="0"/>
-          <w:i w:val="0"/>
-          <w:sz w:val="22"/>
-        </w:rPr>
-        <w:t>Words that signal a REASON or PURPOSE — the answer usually sits right next to them.</w:t>
-      </w:r>
-    </w:p>
-    <w:p>
-      <w:pPr>
-        <w:spacing w:after="0"/>
-      </w:pPr>
-      <w:r>
-        <w:rPr>
-          <w:b/>
-          <w:i w:val="0"/>
-          <w:sz w:val="22"/>
-        </w:rPr>
-        <w:t xml:space="preserve">Easy to spot:  </w:t>
-      </w:r>
-      <w:r>
-        <w:rPr>
-          <w:b w:val="0"/>
-          <w:i w:val="0"/>
-          <w:sz w:val="22"/>
-        </w:rPr>
-        <w:t>because, since, as, due to, thanks to, so that, to + verb, in order to</w:t>
-      </w:r>
-    </w:p>
-    <w:p>
-      <w:pPr>
-        <w:spacing w:after="80"/>
-      </w:pPr>
-      <w:r>
-        <w:rPr>
-          <w:b/>
-          <w:i w:val="0"/>
-          <w:sz w:val="22"/>
-        </w:rPr>
-        <w:t xml:space="preserve">Easy to miss (watch out!):  </w:t>
-      </w:r>
-      <w:r>
-        <w:rPr>
-          <w:b w:val="0"/>
-          <w:i w:val="0"/>
-          <w:sz w:val="22"/>
-        </w:rPr>
-        <w:t>given + noun (“given the heat”), with + noun (“with heavy rain”), out of + noun (“out of fear”), prompted by, driven by, in an attempt to, so as to, for fear of, in response to</w:t>
-      </w:r>
-    </w:p>
-    <w:p>
-      <w:pPr>
-        <w:spacing w:after="0"/>
-      </w:pPr>
-      <w:r>
-        <w:rPr>
-          <w:b/>
-          <w:i w:val="0"/>
-          <w:sz w:val="22"/>
-        </w:rPr>
-        <w:t>Punctuation clues — read to the RIGHT of the mark:</w:t>
-      </w:r>
-    </w:p>
-    <w:p>
-      <w:pPr>
-        <w:spacing w:after="0"/>
-      </w:pPr>
-      <w:r>
-        <w:rPr>
-          <w:b w:val="0"/>
-          <w:i w:val="0"/>
-          <w:sz w:val="22"/>
-        </w:rPr>
-        <w:t>•  Dash (—) and colon (:): the reason / explanation follows the mark.</w:t>
-      </w:r>
-    </w:p>
-    <w:p>
-      <w:pPr>
-        <w:spacing w:after="0"/>
-      </w:pPr>
-      <w:r>
-        <w:rPr>
-          <w:b w:val="0"/>
-          <w:i w:val="0"/>
-          <w:sz w:val="22"/>
-        </w:rPr>
-        <w:t>•  Quotation marks (“ ”): the speaker’s own words — the reason often sits inside them.</w:t>
-      </w:r>
-    </w:p>
-    <w:p>
-      <w:pPr>
-        <w:spacing w:after="0"/>
-      </w:pPr>
-      <w:r>
-        <w:rPr>
-          <w:b w:val="0"/>
-          <w:i w:val="0"/>
-          <w:sz w:val="22"/>
-        </w:rPr>
-        <w:t>•  Brackets ( ), semicolon (;): extra information; two linked ideas — the reason can be on either side.</w:t>
-      </w:r>
-    </w:p>
+    <w:tbl>
+      <w:tblPr>
+        <w:tblStyle w:val="TableGrid"/>
+        <w:tblW w:type="auto" w:w="0"/>
+        <w:tblLook w:firstColumn="1" w:firstRow="1" w:lastColumn="0" w:lastRow="0" w:noHBand="0" w:noVBand="1" w:val="04A0"/>
+      </w:tblPr>
+      <w:tblGrid>
+        <w:gridCol w:w="10224"/>
+      </w:tblGrid>
+      <w:tr>
+        <w:tc>
+          <w:tcPr>
+            <w:tcW w:type="dxa" w:w="10224"/>
+          </w:tcPr>
+          <w:p>
+            <w:r>
+              <w:rPr>
+                <w:b w:val="0"/>
+                <w:i w:val="0"/>
+                <w:sz w:val="22"/>
+              </w:rPr>
+              <w:t>Words that signal a REASON or PURPOSE — the answer usually sits right next to them.</w:t>
+            </w:r>
+          </w:p>
+          <w:p>
+            <w:r>
+              <w:rPr>
+                <w:b/>
+                <w:i w:val="0"/>
+                <w:sz w:val="22"/>
+              </w:rPr>
+              <w:t xml:space="preserve">Easy to spot:  </w:t>
+            </w:r>
+            <w:r>
+              <w:rPr>
+                <w:b w:val="0"/>
+                <w:i w:val="0"/>
+                <w:sz w:val="22"/>
+              </w:rPr>
+              <w:t>because, since, as, due to, thanks to, so that, to + verb, in order to</w:t>
+            </w:r>
+          </w:p>
+          <w:p>
+            <w:r>
+              <w:rPr>
+                <w:b/>
+                <w:i w:val="0"/>
+                <w:sz w:val="22"/>
+              </w:rPr>
+              <w:t xml:space="preserve">Easy to miss (watch out!):  </w:t>
+            </w:r>
+            <w:r>
+              <w:rPr>
+                <w:b w:val="0"/>
+                <w:i w:val="0"/>
+                <w:sz w:val="22"/>
+              </w:rPr>
+              <w:t>given + noun (“given the heat”), with + noun (“with heavy rain”), out of + noun (“out of fear”), prompted by, driven by, in an attempt to, so as to, for fear of, in response to</w:t>
+            </w:r>
+          </w:p>
+        </w:tc>
+      </w:tr>
+      <w:tr>
+        <w:tc>
+          <w:tcPr>
+            <w:tcW w:type="dxa" w:w="10224"/>
+          </w:tcPr>
+          <w:p>
+            <w:r>
+              <w:rPr>
+                <w:b/>
+                <w:i w:val="0"/>
+                <w:sz w:val="22"/>
+              </w:rPr>
+              <w:t>Punctuation clues — read to the RIGHT of the mark:</w:t>
+            </w:r>
+          </w:p>
+          <w:p>
+            <w:r>
+              <w:rPr>
+                <w:b w:val="0"/>
+                <w:i w:val="0"/>
+                <w:sz w:val="22"/>
+              </w:rPr>
+              <w:t>•  Dash (—) and colon (:): the reason / explanation follows the mark.</w:t>
+            </w:r>
+          </w:p>
+          <w:p>
+            <w:r>
+              <w:rPr>
+                <w:b w:val="0"/>
+                <w:i w:val="0"/>
+                <w:sz w:val="22"/>
+              </w:rPr>
+              <w:t>•  Quotation marks (“ ”): the speaker’s own words — the reason often sits inside them.</w:t>
+            </w:r>
+          </w:p>
+          <w:p>
+            <w:r>
+              <w:rPr>
+                <w:b w:val="0"/>
+                <w:i w:val="0"/>
+                <w:sz w:val="22"/>
+              </w:rPr>
+              <w:t>•  Brackets ( ), semicolon (;): extra information; two linked ideas — the reason can be on either side.</w:t>
+            </w:r>
+          </w:p>
+        </w:tc>
+      </w:tr>
+    </w:tbl>
     <w:p>
       <w:pPr>
         <w:pStyle w:val="Heading1"/>
@@ -1406,6 +1408,54 @@
         </w:rPr>
         <w:t>Use ONE word to complete each blank. You should make sure that your answers are grammatically correct, paying attention to word form, plurals, etc.</w:t>
       </w:r>
+      <w:r>
+        <w:rPr>
+          <w:b w:val="0"/>
+          <w:i w:val="0"/>
+          <w:sz w:val="22"/>
+        </w:rPr>
+        <w:t xml:space="preserve"> (4 marks)</w:t>
+      </w:r>
+    </w:p>
+    <w:tbl>
+      <w:tblPr>
+        <w:tblStyle w:val="TableGrid"/>
+        <w:tblW w:type="auto" w:w="0"/>
+        <w:tblLook w:firstColumn="1" w:firstRow="1" w:lastColumn="0" w:lastRow="0" w:noHBand="0" w:noVBand="1" w:val="04A0"/>
+      </w:tblPr>
+      <w:tblGrid>
+        <w:gridCol w:w="10224"/>
+      </w:tblGrid>
+      <w:tr>
+        <w:tc>
+          <w:tcPr>
+            <w:tcW w:type="dxa" w:w="10224"/>
+          </w:tcPr>
+          <w:p>
+            <w:r/>
+            <w:r>
+              <w:rPr>
+                <w:b w:val="0"/>
+                <w:i w:val="0"/>
+                <w:sz w:val="22"/>
+              </w:rPr>
+              <w:t>The next challenge for (i) ______________  is to (ii) ______________  a procedure for (iii) ______________  color to the warriors now that a (iv) ______________  has been developed to hold together the soil.</w:t>
+            </w:r>
+          </w:p>
+        </w:tc>
+      </w:tr>
+    </w:tbl>
+    <w:p>
+      <w:pPr>
+        <w:spacing w:after="40"/>
+      </w:pPr>
+      <w:r>
+        <w:rPr>
+          <w:b w:val="0"/>
+          <w:i w:val="0"/>
+          <w:sz w:val="22"/>
+        </w:rPr>
+      </w:r>
     </w:p>
     <w:p>
       <w:pPr>
@@ -1417,7 +1467,6 @@
           <w:i w:val="0"/>
           <w:sz w:val="22"/>
         </w:rPr>
-        <w:t>The next challenge for (i) ______________  is to (ii) ______________  a procedure for (iii) ______________  color to the warriors now that a (iv) ______________  has been developed to hold together the soil.  (4 marks)</w:t>
       </w:r>
     </w:p>
     <w:p>
@@ -1430,7 +1479,7 @@
           <w:i w:val="0"/>
           <w:sz w:val="22"/>
         </w:rPr>
-        <w:t xml:space="preserve">Your score: </w:t>
+        <w:t>Your score:</w:t>
       </w:r>
       <w:r>
         <w:rPr>
@@ -1438,7 +1487,7 @@
           <w:i w:val="0"/>
           <w:sz w:val="22"/>
         </w:rPr>
-        <w:t xml:space="preserve"> _____ / 12</w:t>
+        <w:t xml:space="preserve">  _____ / 12</w:t>
       </w:r>
     </w:p>
     <w:sectPr>

</xml_diff>